<commit_message>
Fix broken rows, captions and folder listing in the report
Co-Authored-By: Claude Opus 5.5 <noreply@anthropic.com>
</commit_message>
<xml_diff>
--- a/docs/StudyPulse-Phase1-Report.docx
+++ b/docs/StudyPulse-Phase1-Report.docx
@@ -252,7 +252,7 @@
                 <w:szCs w:val="20"/>
                 <w:rFonts w:ascii="Times New Roman" w:cs="Times New Roman" w:eastAsia="Times New Roman" w:hAnsi="Times New Roman"/>
               </w:rPr>
-              <w:t xml:space="preserve">Student 1</w:t>
+              <w:t xml:space="preserve">Member</w:t>
             </w:r>
           </w:p>
         </w:tc>
@@ -286,7 +286,7 @@
                 <w:szCs w:val="20"/>
                 <w:rFonts w:ascii="Times New Roman" w:cs="Times New Roman" w:eastAsia="Times New Roman" w:hAnsi="Times New Roman"/>
               </w:rPr>
-              <w:t xml:space="preserve">1121577</w:t>
+              <w:t xml:space="preserve">Student ID</w:t>
             </w:r>
           </w:p>
         </w:tc>
@@ -320,7 +320,7 @@
                 <w:szCs w:val="20"/>
                 <w:rFonts w:ascii="Times New Roman" w:cs="Times New Roman" w:eastAsia="Times New Roman" w:hAnsi="Times New Roman"/>
               </w:rPr>
-              <w:t xml:space="preserve">Bike sharing service</w:t>
+              <w:t xml:space="preserve">Feature owned</w:t>
             </w:r>
           </w:p>
         </w:tc>
@@ -354,7 +354,7 @@
                 <w:szCs w:val="20"/>
                 <w:rFonts w:ascii="Times New Roman" w:cs="Times New Roman" w:eastAsia="Times New Roman" w:hAnsi="Times New Roman"/>
               </w:rPr>
-              <w:t xml:space="preserve">$1000000</w:t>
+              <w:t xml:space="preserve">Phase 1 contribution</w:t>
             </w:r>
           </w:p>
         </w:tc>
@@ -1141,7 +1141,7 @@
                 <w:sz w:val="19"/>
                 <w:szCs w:val="19"/>
               </w:rPr>
-              <w:t xml:space="preserve">FR5 All tasks shall be listed in order by due date with to do tasks first, and then allow the student to filter them by status (to do, done, all) and type, search by title or course code, and have a clear message if no results are found.</w:t>
+              <w:t xml:space="preserve">FR5</w:t>
             </w:r>
           </w:p>
         </w:tc>
@@ -1162,28 +1162,28 @@
                 <w:sz w:val="19"/>
                 <w:szCs w:val="19"/>
               </w:rPr>
+              <w:t xml:space="preserve">All tasks shall be listed in order by due date with to do tasks first, and then allow the student to filter them by status (to do, done, all) and type, search by title or course code, and have a clear message if no results are found.</w:t>
+            </w:r>
+          </w:p>
+        </w:tc>
+        <w:tc>
+          <w:tcPr>
+            <w:tcW w:type="dxa" w:w="2900"/>
+            <w:tcMar>
+              <w:top w:type="dxa" w:w="60"/>
+              <w:left w:type="dxa" w:w="100"/>
+              <w:bottom w:type="dxa" w:w="60"/>
+              <w:right w:type="dxa" w:w="100"/>
+            </w:tcMar>
+          </w:tcPr>
+          <w:p>
+            <w:r>
+              <w:rPr>
+                <w:color w:val="000000"/>
+                <w:sz w:val="19"/>
+                <w:szCs w:val="19"/>
+              </w:rPr>
               <w:t xml:space="preserve">As you add more courses, the list expands rapidly and with the help of filters and a search function, you can easily find one task.</w:t>
-            </w:r>
-          </w:p>
-        </w:tc>
-        <w:tc>
-          <w:tcPr>
-            <w:tcW w:type="dxa" w:w="2900"/>
-            <w:tcMar>
-              <w:top w:type="dxa" w:w="60"/>
-              <w:left w:type="dxa" w:w="100"/>
-              <w:bottom w:type="dxa" w:w="60"/>
-              <w:right w:type="dxa" w:w="100"/>
-            </w:tcMar>
-          </w:tcPr>
-          <w:p>
-            <w:r>
-              <w:rPr>
-                <w:color w:val="000000"/>
-                <w:sz w:val="19"/>
-                <w:szCs w:val="19"/>
-              </w:rPr>
-              <w:t xml:space="preserve"/>
             </w:r>
           </w:p>
         </w:tc>
@@ -1348,7 +1348,7 @@
                 <w:sz w:val="19"/>
                 <w:szCs w:val="19"/>
               </w:rPr>
-              <w:t xml:space="preserve">FR8(Phase 2, Google API): Once the student requests the system shall add the task/exam to the student's Google Calendar via the Google Calendar API and display an error message and leave the task unchanged if the request fails.</w:t>
+              <w:t xml:space="preserve">FR8</w:t>
             </w:r>
           </w:p>
         </w:tc>
@@ -1369,28 +1369,28 @@
                 <w:sz w:val="19"/>
                 <w:szCs w:val="19"/>
               </w:rPr>
+              <w:t xml:space="preserve">(Phase 2, Google API) Once the student requests the system shall add the task/exam to the student's Google Calendar via the Google Calendar API and display an error message and leave the task unchanged if the request fails.</w:t>
+            </w:r>
+          </w:p>
+        </w:tc>
+        <w:tc>
+          <w:tcPr>
+            <w:tcW w:type="dxa" w:w="2900"/>
+            <w:tcMar>
+              <w:top w:type="dxa" w:w="60"/>
+              <w:left w:type="dxa" w:w="100"/>
+              <w:bottom w:type="dxa" w:w="60"/>
+              <w:right w:type="dxa" w:w="100"/>
+            </w:tcMar>
+          </w:tcPr>
+          <w:p>
+            <w:r>
+              <w:rPr>
+                <w:color w:val="000000"/>
+                <w:sz w:val="19"/>
+                <w:szCs w:val="19"/>
+              </w:rPr>
               <w:t xml:space="preserve">Exams are exported, so that the students who already have their week organised in Google Calendar are kept in sync.</w:t>
-            </w:r>
-          </w:p>
-        </w:tc>
-        <w:tc>
-          <w:tcPr>
-            <w:tcW w:type="dxa" w:w="2900"/>
-            <w:tcMar>
-              <w:top w:type="dxa" w:w="60"/>
-              <w:left w:type="dxa" w:w="100"/>
-              <w:bottom w:type="dxa" w:w="60"/>
-              <w:right w:type="dxa" w:w="100"/>
-            </w:tcMar>
-          </w:tcPr>
-          <w:p>
-            <w:r>
-              <w:rPr>
-                <w:color w:val="000000"/>
-                <w:sz w:val="19"/>
-                <w:szCs w:val="19"/>
-              </w:rPr>
-              <w:t xml:space="preserve"/>
             </w:r>
           </w:p>
         </w:tc>
@@ -1484,7 +1484,7 @@
           <w:sz w:val="18"/>
           <w:szCs w:val="18"/>
         </w:rPr>
-        <w:t xml:space="preserve">StudyPulse use case diagram (UC 1–5)</w:t>
+        <w:t xml:space="preserve">Figure 1: StudyPulse use case diagram (UC1 to UC5)</w:t>
       </w:r>
     </w:p>
     <w:p>
@@ -1506,7 +1506,7 @@
         <w:rPr>
           <w:color w:val="000000"/>
         </w:rPr>
-        <w:t xml:space="preserve">It is a UC1 View Today Dashboard (FR6) report. Student logs in to the app and views the dashboard: weekly progress, overdue assignments, assignments due today, and upcoming exams. From here a task can be opened, ticked off or added.</w:t>
+        <w:t xml:space="preserve">UC1 View Today Dashboard (FR6). Student opens the app and views the dashboard: weekly progress, overdue assignments, assignments due today, and upcoming exams. From here a task can be opened, ticked off or added.</w:t>
       </w:r>
     </w:p>
     <w:p>
@@ -1796,13 +1796,55 @@
                 <w:sz w:val="19"/>
                 <w:szCs w:val="19"/>
               </w:rPr>
+              <w:t xml:space="preserve">FR2</w:t>
+            </w:r>
+          </w:p>
+        </w:tc>
+        <w:tc>
+          <w:tcPr>
+            <w:tcW w:type="dxa" w:w="3700"/>
+            <w:tcMar>
+              <w:top w:type="dxa" w:w="60"/>
+              <w:left w:type="dxa" w:w="100"/>
+              <w:bottom w:type="dxa" w:w="60"/>
+              <w:right w:type="dxa" w:w="100"/>
+            </w:tcMar>
+          </w:tcPr>
+          <w:p>
+            <w:r>
+              <w:rPr>
+                <w:color w:val="000000"/>
+                <w:sz w:val="19"/>
+                <w:szCs w:val="19"/>
+              </w:rPr>
+              <w:t xml:space="preserve">UC3 «include» Validate Task Details</w:t>
+            </w:r>
+          </w:p>
+        </w:tc>
+        <w:tc>
+          <w:tcPr>
+            <w:tcW w:type="dxa" w:w="3526"/>
+            <w:tcMar>
+              <w:top w:type="dxa" w:w="60"/>
+              <w:left w:type="dxa" w:w="100"/>
+              <w:bottom w:type="dxa" w:w="60"/>
+              <w:right w:type="dxa" w:w="100"/>
+            </w:tcMar>
+          </w:tcPr>
+          <w:p>
+            <w:r>
+              <w:rPr>
+                <w:color w:val="000000"/>
+                <w:sz w:val="19"/>
+                <w:szCs w:val="19"/>
+              </w:rPr>
               <w:t xml:space="preserve">Add / Edit Task</w:t>
             </w:r>
           </w:p>
         </w:tc>
         <w:tc>
           <w:tcPr>
-            <w:tcW w:type="dxa" w:w="3700"/>
+            <w:tcW w:type="dxa" w:w="1000"/>
             <w:tcMar>
               <w:top w:type="dxa" w:w="60"/>
               <w:left w:type="dxa" w:w="100"/>
@@ -1818,48 +1860,6 @@
                 <w:szCs w:val="19"/>
               </w:rPr>
               <w:t xml:space="preserve">1</w:t>
-            </w:r>
-          </w:p>
-        </w:tc>
-        <w:tc>
-          <w:tcPr>
-            <w:tcW w:type="dxa" w:w="3526"/>
-            <w:tcMar>
-              <w:top w:type="dxa" w:w="60"/>
-              <w:left w:type="dxa" w:w="100"/>
-              <w:bottom w:type="dxa" w:w="60"/>
-              <w:right w:type="dxa" w:w="100"/>
-            </w:tcMar>
-          </w:tcPr>
-          <w:p>
-            <w:r>
-              <w:rPr>
-                <w:color w:val="000000"/>
-                <w:sz w:val="19"/>
-                <w:szCs w:val="19"/>
-              </w:rPr>
-              <w:t xml:space="preserve">FR2</w:t>
-            </w:r>
-          </w:p>
-        </w:tc>
-        <w:tc>
-          <w:tcPr>
-            <w:tcW w:type="dxa" w:w="1000"/>
-            <w:tcMar>
-              <w:top w:type="dxa" w:w="60"/>
-              <w:left w:type="dxa" w:w="100"/>
-              <w:bottom w:type="dxa" w:w="60"/>
-              <w:right w:type="dxa" w:w="100"/>
-            </w:tcMar>
-          </w:tcPr>
-          <w:p>
-            <w:r>
-              <w:rPr>
-                <w:color w:val="000000"/>
-                <w:sz w:val="19"/>
-                <w:szCs w:val="19"/>
-              </w:rPr>
-              <w:t xml:space="preserve">UC3 «include» Validate Task Details</w:t>
             </w:r>
           </w:p>
         </w:tc>
@@ -1976,7 +1976,7 @@
                 <w:sz w:val="19"/>
                 <w:szCs w:val="19"/>
               </w:rPr>
-              <w:t xml:space="preserve">1 FR4</w:t>
+              <w:t xml:space="preserve">FR4</w:t>
             </w:r>
           </w:p>
         </w:tc>
@@ -2039,7 +2039,7 @@
                 <w:sz w:val="19"/>
                 <w:szCs w:val="19"/>
               </w:rPr>
-              <w:t xml:space="preserve"/>
+              <w:t xml:space="preserve">1</w:t>
             </w:r>
           </w:p>
         </w:tc>
@@ -2314,22 +2314,101 @@
           </w:p>
         </w:tc>
       </w:tr>
+      <w:tr>
+        <w:trPr>
+          <w:cantSplit/>
+          <w:tblHeader w:val="false"/>
+        </w:trPr>
+        <w:tc>
+          <w:tcPr>
+            <w:tcW w:type="dxa" w:w="800"/>
+            <w:tcMar>
+              <w:top w:type="dxa" w:w="60"/>
+              <w:left w:type="dxa" w:w="100"/>
+              <w:bottom w:type="dxa" w:w="60"/>
+              <w:right w:type="dxa" w:w="100"/>
+            </w:tcMar>
+          </w:tcPr>
+          <w:p>
+            <w:r>
+              <w:rPr>
+                <w:color w:val="000000"/>
+                <w:sz w:val="19"/>
+                <w:szCs w:val="19"/>
+              </w:rPr>
+              <w:t xml:space="preserve">FR8</w:t>
+            </w:r>
+          </w:p>
+        </w:tc>
+        <w:tc>
+          <w:tcPr>
+            <w:tcW w:type="dxa" w:w="3700"/>
+            <w:tcMar>
+              <w:top w:type="dxa" w:w="60"/>
+              <w:left w:type="dxa" w:w="100"/>
+              <w:bottom w:type="dxa" w:w="60"/>
+              <w:right w:type="dxa" w:w="100"/>
+            </w:tcMar>
+          </w:tcPr>
+          <w:p>
+            <w:r>
+              <w:rPr>
+                <w:color w:val="000000"/>
+                <w:sz w:val="19"/>
+                <w:szCs w:val="19"/>
+              </w:rPr>
+              <w:t xml:space="preserve">Export to Google Calendar (UC3)</w:t>
+            </w:r>
+          </w:p>
+        </w:tc>
+        <w:tc>
+          <w:tcPr>
+            <w:tcW w:type="dxa" w:w="3526"/>
+            <w:tcMar>
+              <w:top w:type="dxa" w:w="60"/>
+              <w:left w:type="dxa" w:w="100"/>
+              <w:bottom w:type="dxa" w:w="60"/>
+              <w:right w:type="dxa" w:w="100"/>
+            </w:tcMar>
+          </w:tcPr>
+          <w:p>
+            <w:r>
+              <w:rPr>
+                <w:color w:val="000000"/>
+                <w:sz w:val="19"/>
+                <w:szCs w:val="19"/>
+              </w:rPr>
+              <w:t xml:space="preserve">Add / Edit Task</w:t>
+            </w:r>
+          </w:p>
+        </w:tc>
+        <w:tc>
+          <w:tcPr>
+            <w:tcW w:type="dxa" w:w="1000"/>
+            <w:tcMar>
+              <w:top w:type="dxa" w:w="60"/>
+              <w:left w:type="dxa" w:w="100"/>
+              <w:bottom w:type="dxa" w:w="60"/>
+              <w:right w:type="dxa" w:w="100"/>
+            </w:tcMar>
+          </w:tcPr>
+          <w:p>
+            <w:r>
+              <w:rPr>
+                <w:color w:val="000000"/>
+                <w:sz w:val="19"/>
+                <w:szCs w:val="19"/>
+              </w:rPr>
+              <w:t xml:space="preserve">2</w:t>
+            </w:r>
+          </w:p>
+        </w:tc>
+      </w:tr>
     </w:tbl>
     <w:p>
       <w:pPr>
         <w:spacing w:after="120"/>
       </w:pPr>
-    </w:p>
-    <w:p>
-      <w:pPr>
-        <w:spacing w:after="120" w:line="276"/>
-      </w:pPr>
-      <w:r>
-        <w:rPr>
-          <w:color w:val="000000"/>
-        </w:rPr>
-        <w:t xml:space="preserve">In addition to the aforementioned features, the device supports FR8 export to Google Calendar (UC3), Add / Edit Task and more.</w:t>
-      </w:r>
     </w:p>
     <w:p>
       <w:pPr>
@@ -2396,7 +2475,7 @@
                 <w:sz w:val="19"/>
                 <w:szCs w:val="19"/>
               </w:rPr>
-              <w:t xml:space="preserve">1,000 branches</w:t>
+              <w:t xml:space="preserve">Branch</w:t>
             </w:r>
           </w:p>
         </w:tc>
@@ -2420,7 +2499,7 @@
                 <w:sz w:val="19"/>
                 <w:szCs w:val="19"/>
               </w:rPr>
-              <w:t xml:space="preserve">Use case, key flow 1,000 cases on each branch.</w:t>
+              <w:t xml:space="preserve">Use case</w:t>
             </w:r>
           </w:p>
         </w:tc>
@@ -2444,7 +2523,7 @@
                 <w:sz w:val="19"/>
                 <w:szCs w:val="19"/>
               </w:rPr>
-              <w:t xml:space="preserve"/>
+              <w:t xml:space="preserve">Key flow</w:t>
             </w:r>
           </w:p>
         </w:tc>
@@ -2609,7 +2688,7 @@
                 <w:sz w:val="19"/>
                 <w:szCs w:val="19"/>
               </w:rPr>
-              <w:t xml:space="preserve">UC5 Toggles tasks between "done" and "not done" and updates weekly progress.</w:t>
+              <w:t xml:space="preserve">[mark done]</w:t>
             </w:r>
           </w:p>
         </w:tc>
@@ -2630,7 +2709,7 @@
                 <w:sz w:val="19"/>
                 <w:szCs w:val="19"/>
               </w:rPr>
-              <w:t xml:space="preserve"/>
+              <w:t xml:space="preserve">UC5</w:t>
             </w:r>
           </w:p>
         </w:tc>
@@ -2651,7 +2730,7 @@
                 <w:sz w:val="19"/>
                 <w:szCs w:val="19"/>
               </w:rPr>
-              <w:t xml:space="preserve"/>
+              <w:t xml:space="preserve">Toggles tasks between "done" and "not done" and updates weekly progress.</w:t>
             </w:r>
           </w:p>
         </w:tc>
@@ -2747,49 +2826,49 @@
                 <w:sz w:val="19"/>
                 <w:szCs w:val="19"/>
               </w:rPr>
+              <w:t xml:space="preserve">[add / edit]</w:t>
+            </w:r>
+          </w:p>
+        </w:tc>
+        <w:tc>
+          <w:tcPr>
+            <w:tcW w:type="dxa" w:w="1000"/>
+            <w:tcMar>
+              <w:top w:type="dxa" w:w="60"/>
+              <w:left w:type="dxa" w:w="100"/>
+              <w:bottom w:type="dxa" w:w="60"/>
+              <w:right w:type="dxa" w:w="100"/>
+            </w:tcMar>
+          </w:tcPr>
+          <w:p>
+            <w:r>
+              <w:rPr>
+                <w:color w:val="000000"/>
+                <w:sz w:val="19"/>
+                <w:szCs w:val="19"/>
+              </w:rPr>
+              <w:t xml:space="preserve">UC3</w:t>
+            </w:r>
+          </w:p>
+        </w:tc>
+        <w:tc>
+          <w:tcPr>
+            <w:tcW w:type="dxa" w:w="6526"/>
+            <w:tcMar>
+              <w:top w:type="dxa" w:w="60"/>
+              <w:left w:type="dxa" w:w="100"/>
+              <w:bottom w:type="dxa" w:w="60"/>
+              <w:right w:type="dxa" w:w="100"/>
+            </w:tcMar>
+          </w:tcPr>
+          <w:p>
+            <w:r>
+              <w:rPr>
+                <w:color w:val="000000"/>
+                <w:sz w:val="19"/>
+                <w:szCs w:val="19"/>
+              </w:rPr>
               <w:t xml:space="preserve">If need be, add / edit the details and check for validity, repeat until valid. Record the task on the phone, set up a reminder (Phase 2) and add to Google Calendar (Phase 2) if student requested (the last two).</w:t>
-            </w:r>
-          </w:p>
-        </w:tc>
-        <w:tc>
-          <w:tcPr>
-            <w:tcW w:type="dxa" w:w="1000"/>
-            <w:tcMar>
-              <w:top w:type="dxa" w:w="60"/>
-              <w:left w:type="dxa" w:w="100"/>
-              <w:bottom w:type="dxa" w:w="60"/>
-              <w:right w:type="dxa" w:w="100"/>
-            </w:tcMar>
-          </w:tcPr>
-          <w:p>
-            <w:r>
-              <w:rPr>
-                <w:color w:val="000000"/>
-                <w:sz w:val="19"/>
-                <w:szCs w:val="19"/>
-              </w:rPr>
-              <w:t xml:space="preserve"/>
-            </w:r>
-          </w:p>
-        </w:tc>
-        <w:tc>
-          <w:tcPr>
-            <w:tcW w:type="dxa" w:w="6526"/>
-            <w:tcMar>
-              <w:top w:type="dxa" w:w="60"/>
-              <w:left w:type="dxa" w:w="100"/>
-              <w:bottom w:type="dxa" w:w="60"/>
-              <w:right w:type="dxa" w:w="100"/>
-            </w:tcMar>
-          </w:tcPr>
-          <w:p>
-            <w:r>
-              <w:rPr>
-                <w:color w:val="000000"/>
-                <w:sz w:val="19"/>
-                <w:szCs w:val="19"/>
-              </w:rPr>
-              <w:t xml:space="preserve"/>
             </w:r>
           </w:p>
         </w:tc>
@@ -2816,7 +2895,7 @@
                 <w:sz w:val="19"/>
                 <w:szCs w:val="19"/>
               </w:rPr>
-              <w:t xml:space="preserve">Close App — End of the activity.</w:t>
+              <w:t xml:space="preserve">[close app]</w:t>
             </w:r>
           </w:p>
         </w:tc>
@@ -2837,7 +2916,7 @@
                 <w:sz w:val="19"/>
                 <w:szCs w:val="19"/>
               </w:rPr>
-              <w:t xml:space="preserve"/>
+              <w:t xml:space="preserve">—</w:t>
             </w:r>
           </w:p>
         </w:tc>
@@ -2858,7 +2937,7 @@
                 <w:sz w:val="19"/>
                 <w:szCs w:val="19"/>
               </w:rPr>
-              <w:t xml:space="preserve"/>
+              <w:t xml:space="preserve">End of the activity.</w:t>
             </w:r>
           </w:p>
         </w:tc>
@@ -2930,7 +3009,7 @@
           <w:sz w:val="18"/>
           <w:szCs w:val="18"/>
         </w:rPr>
-        <w:t xml:space="preserve">StudyPulse activity diagram (2)</w:t>
+        <w:t xml:space="preserve">Figure 2: StudyPulse activity diagram</w:t>
       </w:r>
     </w:p>
     <w:p>
@@ -2942,7 +3021,7 @@
         <w:rPr>
           <w:color w:val="000000"/>
         </w:rPr>
-        <w:t xml:space="preserve">The development of UI prototype and implementation;</w:t>
+        <w:t xml:space="preserve">5. UI Prototype and Implementation</w:t>
       </w:r>
     </w:p>
     <w:p>
@@ -2975,7 +3054,7 @@
         <w:rPr>
           <w:color w:val="000000"/>
         </w:rPr>
-        <w:t xml:space="preserve">The initial screen that the student encounters. It welcomes the student with the date and a card indicating how many of the tasks are completed in the next 7 days, has a progress bar and the number of exams to come. Below it, the tasks in red are the tasks that are overdue, followed by the tasks Due today and the Upcoming exams of the next 14 days. Priority of each task card is indicated by a coloured bar (red, amber, grey), a type pill with icon, course code and a due label (Overdue, Today, Tomorrow or date and time). The circle will be checked once tapped, the card will be opened for editing when tapped and the + will add a task. Blank spaces state the same “Nothing due today. Have a great time!</w:t>
+        <w:t xml:space="preserve">The initial screen that the student encounters. It welcomes the student with the date and a card indicating how many of the tasks are completed in the next 7 days, has a progress bar and the number of exams to come. Below it, the tasks in red are the tasks that are overdue, followed by the tasks Due today and the Upcoming exams of the next 14 days. Priority of each task card is indicated by a coloured bar (red, amber, grey), a type pill with icon, course code and a due label (Overdue, Today, Tomorrow or date and time). The circle will be checked once tapped, the card will be opened for editing when tapped and the + will add a task. Blank spaces state the same “Nothing due today. Enjoy the free time!”</w:t>
       </w:r>
     </w:p>
     <w:tbl>
@@ -3699,7 +3778,7 @@
                 <w:sz w:val="18"/>
                 <w:szCs w:val="18"/>
               </w:rPr>
-              <w:t xml:space="preserve">Save changes and delete task… is the Edit task dialog box.The Edit task dialog box is shown in figure 10.</w:t>
+              <w:t xml:space="preserve">Figure 10: Edit task: Save changes and Delete task</w:t>
             </w:r>
           </w:p>
         </w:tc>
@@ -3713,7 +3792,7 @@
         <w:rPr>
           <w:color w:val="000000"/>
         </w:rPr>
-        <w:t xml:space="preserve">This represents the loading, empty and error states of 5.4.</w:t>
+        <w:t xml:space="preserve">5.4 Loading, empty and error states</w:t>
       </w:r>
     </w:p>
     <w:p>
@@ -3757,7 +3836,7 @@
         <w:rPr>
           <w:color w:val="000000"/>
         </w:rPr>
-        <w:t xml:space="preserve">Instead of showing tasks, you will see empty instead.Empty: “Nothing due today”, “No exams in the next two weeks”, “No tasks match” (with Clear filters), “No tasks yet” (with Add a task), “Task not found” for an invalid task id.</w:t>
+        <w:t xml:space="preserve">Empty: “Nothing due today”, “No exams in the next two weeks”, “No tasks match” (with Clear filters), “No tasks yet” (with Add a task), “Task not found” for an invalid task id.</w:t>
       </w:r>
     </w:p>
     <w:p>
@@ -3812,7 +3891,7 @@
         <w:rPr>
           <w:color w:val="000000"/>
         </w:rPr>
-        <w:t xml:space="preserve">The sorting, filtering and dashboard grouping in logic.ts and validateTask() in validation.ts are pure functions that don't import React. The feature: UI primitives in components/ui, design tokens (colours, spacing, radius, font sizes) in theme/tokens.ts, and all route links in navigation/routes.ts are all shared, feature-free code. Imports can only be made in one direction: a feature can use shared code, but not shared code can import a feature.</w:t>
+        <w:t xml:space="preserve">The sorting, filtering and dashboard grouping in logic.ts and validateTask() in validation.ts are pure functions that don't import React. The feature: UI primitives in components/ui, design tokens (colours, spacing, radius, font sizes) in theme/tokens.ts, and all route links in navigation/routes.ts are all shared, feature-free code. Imports can only be made in one direction: a feature can use shared code, but shared code cannot import a feature.</w:t>
       </w:r>
     </w:p>
     <w:p>
@@ -3947,7 +4026,7 @@
                 <w:szCs w:val="16"/>
                 <w:rFonts w:ascii="Consolas" w:cs="Consolas" w:eastAsia="Consolas" w:hAnsi="Consolas"/>
               </w:rPr>
-              <w:t xml:space="preserve">│  │ └─ Layout.tsx                root Layout, provides the App with a common layout.│  └─ _layout.tsx                root Stack, wraps the App in TasksProvider.</w:t>
+              <w:t xml:space="preserve">│  ├─ _layout.tsx            root Stack, wraps the App in TasksProvider</w:t>
             </w:r>
           </w:p>
           <w:p>
@@ -3961,7 +4040,7 @@
                 <w:szCs w:val="16"/>
                 <w:rFonts w:ascii="Consolas" w:cs="Consolas" w:eastAsia="Consolas" w:hAnsi="Consolas"/>
               </w:rPr>
-              <w:t xml:space="preserve">│  ├─ (tabs)/movies.tsx   movies: Today, Movies</w:t>
+              <w:t xml:space="preserve">│  ├─ (tabs)/_layout.tsx     bottom tabs: Today, Tasks</w:t>
             </w:r>
           </w:p>
           <w:p>
@@ -4017,7 +4096,7 @@
                 <w:szCs w:val="16"/>
                 <w:rFonts w:ascii="Consolas" w:cs="Consolas" w:eastAsia="Consolas" w:hAnsi="Consolas"/>
               </w:rPr>
-              <w:t xml:space="preserve">├─ features/tasks/kernel/       everything for the tasks feature (kernel)</w:t>
+              <w:t xml:space="preserve">├─ features/tasks/           everything for the tasks feature</w:t>
             </w:r>
           </w:p>
           <w:p>
@@ -4031,7 +4110,7 @@
                 <w:szCs w:val="16"/>
                 <w:rFonts w:ascii="Consolas" w:cs="Consolas" w:eastAsia="Consolas" w:hAnsi="Consolas"/>
               </w:rPr>
-              <w:t xml:space="preserve">│  ├─ screens/sgl/  SGLScreen</w:t>
+              <w:t xml:space="preserve">│  ├─ screens/               DashboardScreen, TaskListScreen, TaskFormScreen</w:t>
             </w:r>
           </w:p>
           <w:p>
@@ -4045,7 +4124,7 @@
                 <w:szCs w:val="16"/>
                 <w:rFonts w:ascii="Consolas" w:cs="Consolas" w:eastAsia="Consolas" w:hAnsi="Consolas"/>
               </w:rPr>
-              <w:t xml:space="preserve">│  │ └─ components/            TaskCard, TaskSection, WeekProgressCard</w:t>
+              <w:t xml:space="preserve">│  ├─ components/            TaskCard, TaskSection, WeekProgressCard</w:t>
             </w:r>
           </w:p>
           <w:p>
@@ -4129,7 +4208,7 @@
                 <w:szCs w:val="16"/>
                 <w:rFonts w:ascii="Consolas" w:cs="Consolas" w:eastAsia="Consolas" w:hAnsi="Consolas"/>
               </w:rPr>
-              <w:t xml:space="preserve">│  ├─ admin.ts               manageUsers, manageTasks, manageProjects, addProjects</w:t>
+              <w:t xml:space="preserve">│  ├─ logic.ts               sortTasks, filterTasks, buildDashboard, dueLabel</w:t>
             </w:r>
           </w:p>
           <w:p>
@@ -4143,7 +4222,7 @@
                 <w:szCs w:val="16"/>
                 <w:rFonts w:ascii="Consolas" w:cs="Consolas" w:eastAsia="Consolas" w:hAnsi="Consolas"/>
               </w:rPr>
-              <w:t xml:space="preserve">│  ├─ package.json</w:t>
+              <w:t xml:space="preserve">│  └─ dates.ts · meta.ts · sampleData.ts · index.ts</w:t>
             </w:r>
           </w:p>
           <w:p>
@@ -4157,7 +4236,7 @@
                 <w:szCs w:val="16"/>
                 <w:rFonts w:ascii="Consolas" w:cs="Consolas" w:eastAsia="Consolas" w:hAnsi="Consolas"/>
               </w:rPr>
-              <w:t xml:space="preserve">├─ components/ui/ AppButton, Chip, ChoiceField, FormField, EmptyState, …</w:t>
+              <w:t xml:space="preserve">├─ components/ui/            AppButton, Chip, ChoiceField, FormField, EmptyState, …</w:t>
             </w:r>
           </w:p>
           <w:p>
@@ -4171,7 +4250,7 @@
                 <w:szCs w:val="16"/>
                 <w:rFonts w:ascii="Consolas" w:cs="Consolas" w:eastAsia="Consolas" w:hAnsi="Consolas"/>
               </w:rPr>
-              <w:t xml:space="preserve">├─ primary.ts       dupe, ignore, clean and create primary (main) menu.├─ secondary.ts       dupe, ignore, clean and create secondary (additional) menu.</w:t>
+              <w:t xml:space="preserve">├─ navigation/routes.ts      every route link in one place</w:t>
             </w:r>
           </w:p>
           <w:p>
@@ -4185,7 +4264,7 @@
                 <w:szCs w:val="16"/>
                 <w:rFonts w:ascii="Consolas" w:cs="Consolas" w:eastAsia="Consolas" w:hAnsi="Consolas"/>
               </w:rPr>
-              <w:t xml:space="preserve">The AsyncStorage JSON helpers are provided here.Here you will find the AsyncStorage JSON helpers.</w:t>
+              <w:t xml:space="preserve">├─ services/storage.ts       the AsyncStorage JSON helpers</w:t>
             </w:r>
           </w:p>
           <w:p>
@@ -4199,7 +4278,7 @@
                 <w:szCs w:val="16"/>
                 <w:rFonts w:ascii="Consolas" w:cs="Consolas" w:eastAsia="Consolas" w:hAnsi="Consolas"/>
               </w:rPr>
-              <w:t xml:space="preserve">├─ samples/buttons/Button1         basic buttons, spacing, radius, and font sizes.├─ samples/buttons/Button2         basic buttons, spacing, radius, and font sizes.</w:t>
+              <w:t xml:space="preserve">└─ theme/tokens.ts           colours, spacing, radius, font sizes</w:t>
             </w:r>
           </w:p>
         </w:tc>
@@ -4218,7 +4297,7 @@
           <w:sz w:val="18"/>
           <w:szCs w:val="18"/>
         </w:rPr>
-        <w:t xml:space="preserve">This is the source folder for listing 1.This is the source folder for listing 1.</w:t>
+        <w:t xml:space="preserve">Listing 1: StudyPulse source folders</w:t>
       </w:r>
     </w:p>
     <w:p>
@@ -4494,7 +4573,7 @@
                 <w:sz w:val="19"/>
                 <w:szCs w:val="19"/>
               </w:rPr>
-              <w:t xml:space="preserve">Task id: string, title: string, course: string, type: 'assignment' | 'exam' | 'study', priority: 'low' | 'medium' | 'high', dueDate: string (YYYY-MM-DD), dueTime: string (HH:MM or empty), reminderMinutes: number | null, notes: string, done: boolean, createdAt: string (ISO)</w:t>
+              <w:t xml:space="preserve">Task</w:t>
             </w:r>
           </w:p>
         </w:tc>
@@ -4515,13 +4594,34 @@
                 <w:sz w:val="19"/>
                 <w:szCs w:val="19"/>
               </w:rPr>
+              <w:t xml:space="preserve">id: string, title: string, course: string, type: 'assignment' | 'exam' | 'study', priority: 'low' | 'medium' | 'high', dueDate: string (YYYY-MM-DD), dueTime: string (HH:MM or empty), reminderMinutes: number | null, notes: string, done: boolean, createdAt: string (ISO)</w:t>
+            </w:r>
+          </w:p>
+        </w:tc>
+        <w:tc>
+          <w:tcPr>
+            <w:tcW w:type="dxa" w:w="2600"/>
+            <w:tcMar>
+              <w:top w:type="dxa" w:w="60"/>
+              <w:left w:type="dxa" w:w="100"/>
+              <w:bottom w:type="dxa" w:w="60"/>
+              <w:right w:type="dxa" w:w="100"/>
+            </w:tcMar>
+          </w:tcPr>
+          <w:p>
+            <w:r>
+              <w:rPr>
+                <w:color w:val="000000"/>
+                <w:sz w:val="19"/>
+                <w:szCs w:val="19"/>
+              </w:rPr>
               <w:t xml:space="preserve">Local: AsyncStorage, key studypulse/tasks/v1, one JSON array</w:t>
             </w:r>
           </w:p>
         </w:tc>
         <w:tc>
           <w:tcPr>
-            <w:tcW w:type="dxa" w:w="2600"/>
+            <w:tcW w:type="dxa" w:w="800"/>
             <w:tcMar>
               <w:top w:type="dxa" w:w="60"/>
               <w:left w:type="dxa" w:w="100"/>
@@ -4537,27 +4637,6 @@
                 <w:szCs w:val="19"/>
               </w:rPr>
               <w:t xml:space="preserve">1</w:t>
-            </w:r>
-          </w:p>
-        </w:tc>
-        <w:tc>
-          <w:tcPr>
-            <w:tcW w:type="dxa" w:w="800"/>
-            <w:tcMar>
-              <w:top w:type="dxa" w:w="60"/>
-              <w:left w:type="dxa" w:w="100"/>
-              <w:bottom w:type="dxa" w:w="60"/>
-              <w:right w:type="dxa" w:w="100"/>
-            </w:tcMar>
-          </w:tcPr>
-          <w:p>
-            <w:r>
-              <w:rPr>
-                <w:color w:val="000000"/>
-                <w:sz w:val="19"/>
-                <w:szCs w:val="19"/>
-              </w:rPr>
-              <w:t xml:space="preserve"/>
             </w:r>
           </w:p>
         </w:tc>
@@ -4584,13 +4663,55 @@
                 <w:sz w:val="19"/>
                 <w:szCs w:val="19"/>
               </w:rPr>
+              <w:t xml:space="preserve">ScheduledReminder</w:t>
+            </w:r>
+          </w:p>
+        </w:tc>
+        <w:tc>
+          <w:tcPr>
+            <w:tcW w:type="dxa" w:w="3926"/>
+            <w:tcMar>
+              <w:top w:type="dxa" w:w="60"/>
+              <w:left w:type="dxa" w:w="100"/>
+              <w:bottom w:type="dxa" w:w="60"/>
+              <w:right w:type="dxa" w:w="100"/>
+            </w:tcMar>
+          </w:tcPr>
+          <w:p>
+            <w:r>
+              <w:rPr>
+                <w:color w:val="000000"/>
+                <w:sz w:val="19"/>
+                <w:szCs w:val="19"/>
+              </w:rPr>
+              <w:t xml:space="preserve">taskId: string, notificationId: string, fireAt: string (ISO)</w:t>
+            </w:r>
+          </w:p>
+        </w:tc>
+        <w:tc>
+          <w:tcPr>
+            <w:tcW w:type="dxa" w:w="2600"/>
+            <w:tcMar>
+              <w:top w:type="dxa" w:w="60"/>
+              <w:left w:type="dxa" w:w="100"/>
+              <w:bottom w:type="dxa" w:w="60"/>
+              <w:right w:type="dxa" w:w="100"/>
+            </w:tcMar>
+          </w:tcPr>
+          <w:p>
+            <w:r>
+              <w:rPr>
+                <w:color w:val="000000"/>
+                <w:sz w:val="19"/>
+                <w:szCs w:val="19"/>
+              </w:rPr>
               <w:t xml:space="preserve">Local: AsyncStorage; notification itself is scheduled by the phone OS (expo-notifications)</w:t>
             </w:r>
           </w:p>
         </w:tc>
         <w:tc>
           <w:tcPr>
-            <w:tcW w:type="dxa" w:w="3926"/>
+            <w:tcW w:type="dxa" w:w="800"/>
             <w:tcMar>
               <w:top w:type="dxa" w:w="60"/>
               <w:left w:type="dxa" w:w="100"/>
@@ -4606,48 +4727,6 @@
                 <w:szCs w:val="19"/>
               </w:rPr>
               <w:t xml:space="preserve">2</w:t>
-            </w:r>
-          </w:p>
-        </w:tc>
-        <w:tc>
-          <w:tcPr>
-            <w:tcW w:type="dxa" w:w="2600"/>
-            <w:tcMar>
-              <w:top w:type="dxa" w:w="60"/>
-              <w:left w:type="dxa" w:w="100"/>
-              <w:bottom w:type="dxa" w:w="60"/>
-              <w:right w:type="dxa" w:w="100"/>
-            </w:tcMar>
-          </w:tcPr>
-          <w:p>
-            <w:r>
-              <w:rPr>
-                <w:color w:val="000000"/>
-                <w:sz w:val="19"/>
-                <w:szCs w:val="19"/>
-              </w:rPr>
-              <w:t xml:space="preserve"/>
-            </w:r>
-          </w:p>
-        </w:tc>
-        <w:tc>
-          <w:tcPr>
-            <w:tcW w:type="dxa" w:w="800"/>
-            <w:tcMar>
-              <w:top w:type="dxa" w:w="60"/>
-              <w:left w:type="dxa" w:w="100"/>
-              <w:bottom w:type="dxa" w:w="60"/>
-              <w:right w:type="dxa" w:w="100"/>
-            </w:tcMar>
-          </w:tcPr>
-          <w:p>
-            <w:r>
-              <w:rPr>
-                <w:color w:val="000000"/>
-                <w:sz w:val="19"/>
-                <w:szCs w:val="19"/>
-              </w:rPr>
-              <w:t xml:space="preserve"/>
             </w:r>
           </w:p>
         </w:tc>
@@ -4674,7 +4753,7 @@
                 <w:sz w:val="19"/>
                 <w:szCs w:val="19"/>
               </w:rPr>
-              <w:t xml:space="preserve">GoogleEventId: string, exportedAt: string (ISO)</w:t>
+              <w:t xml:space="preserve">CalendarExport</w:t>
             </w:r>
           </w:p>
         </w:tc>
@@ -4695,13 +4774,34 @@
                 <w:sz w:val="19"/>
                 <w:szCs w:val="19"/>
               </w:rPr>
+              <w:t xml:space="preserve">taskId: string, googleEventId: string, exportedAt: string (ISO)</w:t>
+            </w:r>
+          </w:p>
+        </w:tc>
+        <w:tc>
+          <w:tcPr>
+            <w:tcW w:type="dxa" w:w="2600"/>
+            <w:tcMar>
+              <w:top w:type="dxa" w:w="60"/>
+              <w:left w:type="dxa" w:w="100"/>
+              <w:bottom w:type="dxa" w:w="60"/>
+              <w:right w:type="dxa" w:w="100"/>
+            </w:tcMar>
+          </w:tcPr>
+          <w:p>
+            <w:r>
+              <w:rPr>
+                <w:color w:val="000000"/>
+                <w:sz w:val="19"/>
+                <w:szCs w:val="19"/>
+              </w:rPr>
               <w:t xml:space="preserve">Local link in AsyncStorage – the event is stored in the student's Google Calendar (cloud)</w:t>
             </w:r>
           </w:p>
         </w:tc>
         <w:tc>
           <w:tcPr>
-            <w:tcW w:type="dxa" w:w="2600"/>
+            <w:tcW w:type="dxa" w:w="800"/>
             <w:tcMar>
               <w:top w:type="dxa" w:w="60"/>
               <w:left w:type="dxa" w:w="100"/>
@@ -4717,27 +4817,6 @@
                 <w:szCs w:val="19"/>
               </w:rPr>
               <w:t xml:space="preserve">2</w:t>
-            </w:r>
-          </w:p>
-        </w:tc>
-        <w:tc>
-          <w:tcPr>
-            <w:tcW w:type="dxa" w:w="800"/>
-            <w:tcMar>
-              <w:top w:type="dxa" w:w="60"/>
-              <w:left w:type="dxa" w:w="100"/>
-              <w:bottom w:type="dxa" w:w="60"/>
-              <w:right w:type="dxa" w:w="100"/>
-            </w:tcMar>
-          </w:tcPr>
-          <w:p>
-            <w:r>
-              <w:rPr>
-                <w:color w:val="000000"/>
-                <w:sz w:val="19"/>
-                <w:szCs w:val="19"/>
-              </w:rPr>
-              <w:t xml:space="preserve"/>
             </w:r>
           </w:p>
         </w:tc>
@@ -4764,7 +4843,7 @@
                 <w:sz w:val="19"/>
                 <w:szCs w:val="19"/>
               </w:rPr>
-              <w:t xml:space="preserve">The defaultReminderMinutes property is a number that corresponds to the default number of minutes configured for the API notification.The defaultReminderMinutes property is a number representing the default number of minutes for the API notification. Local: AsyncStorage: 2</w:t>
+              <w:t xml:space="preserve">Settings</w:t>
             </w:r>
           </w:p>
         </w:tc>
@@ -4785,7 +4864,7 @@
                 <w:sz w:val="19"/>
                 <w:szCs w:val="19"/>
               </w:rPr>
-              <w:t xml:space="preserve"/>
+              <w:t xml:space="preserve">defaultReminderMinutes: number | null, notificationsAllowed: boolean, googleAccountEmail: string | null</w:t>
             </w:r>
           </w:p>
         </w:tc>
@@ -4806,7 +4885,7 @@
                 <w:sz w:val="19"/>
                 <w:szCs w:val="19"/>
               </w:rPr>
-              <w:t xml:space="preserve"/>
+              <w:t xml:space="preserve">Local: AsyncStorage</w:t>
             </w:r>
           </w:p>
         </w:tc>
@@ -4827,7 +4906,7 @@
                 <w:sz w:val="19"/>
                 <w:szCs w:val="19"/>
               </w:rPr>
-              <w:t xml:space="preserve"/>
+              <w:t xml:space="preserve">2</w:t>
             </w:r>
           </w:p>
         </w:tc>
@@ -4854,7 +4933,7 @@
                 <w:sz w:val="19"/>
                 <w:szCs w:val="19"/>
               </w:rPr>
-              <w:t xml:space="preserve">Type, priority and reminder options: value, label, colour, icon</w:t>
+              <w:t xml:space="preserve">Type, priority and reminder options</w:t>
             </w:r>
           </w:p>
         </w:tc>
@@ -4875,13 +4954,34 @@
                 <w:sz w:val="19"/>
                 <w:szCs w:val="19"/>
               </w:rPr>
+              <w:t xml:space="preserve">value, label, colour, icon</w:t>
+            </w:r>
+          </w:p>
+        </w:tc>
+        <w:tc>
+          <w:tcPr>
+            <w:tcW w:type="dxa" w:w="2600"/>
+            <w:tcMar>
+              <w:top w:type="dxa" w:w="60"/>
+              <w:left w:type="dxa" w:w="100"/>
+              <w:bottom w:type="dxa" w:w="60"/>
+              <w:right w:type="dxa" w:w="100"/>
+            </w:tcMar>
+          </w:tcPr>
+          <w:p>
+            <w:r>
+              <w:rPr>
+                <w:color w:val="000000"/>
+                <w:sz w:val="19"/>
+                <w:szCs w:val="19"/>
+              </w:rPr>
               <w:t xml:space="preserve">Bundled with the app (meta.ts)</w:t>
             </w:r>
           </w:p>
         </w:tc>
         <w:tc>
           <w:tcPr>
-            <w:tcW w:type="dxa" w:w="2600"/>
+            <w:tcW w:type="dxa" w:w="800"/>
             <w:tcMar>
               <w:top w:type="dxa" w:w="60"/>
               <w:left w:type="dxa" w:w="100"/>
@@ -4897,27 +4997,6 @@
                 <w:szCs w:val="19"/>
               </w:rPr>
               <w:t xml:space="preserve">1</w:t>
-            </w:r>
-          </w:p>
-        </w:tc>
-        <w:tc>
-          <w:tcPr>
-            <w:tcW w:type="dxa" w:w="800"/>
-            <w:tcMar>
-              <w:top w:type="dxa" w:w="60"/>
-              <w:left w:type="dxa" w:w="100"/>
-              <w:bottom w:type="dxa" w:w="60"/>
-              <w:right w:type="dxa" w:w="100"/>
-            </w:tcMar>
-          </w:tcPr>
-          <w:p>
-            <w:r>
-              <w:rPr>
-                <w:color w:val="000000"/>
-                <w:sz w:val="19"/>
-                <w:szCs w:val="19"/>
-              </w:rPr>
-              <w:t xml:space="preserve"/>
             </w:r>
           </w:p>
         </w:tc>
@@ -5074,7 +5153,7 @@
           <w:sz w:val="18"/>
           <w:szCs w:val="18"/>
         </w:rPr>
-        <w:t xml:space="preserve">Preliminary data model:</w:t>
+        <w:t xml:space="preserve">Figure 12: Preliminary data model</w:t>
       </w:r>
     </w:p>
     <w:p>

</xml_diff>